<commit_message>
docs: update project development process description
Added a link to a 4-minute demo video showcasing the working system, along with the video file placed in the root directory. This enhances the documentation by providing visual evidence of the project's functionality.
</commit_message>
<xml_diff>
--- a/Project-Development process description.docx
+++ b/Project-Development process description.docx
@@ -1138,23 +1138,7 @@
           <w:i/>
           <w:color w:val="1F4E79"/>
         </w:rPr>
-        <w:t xml:space="preserve"> I used </w:t>
-      </w:r>
-      <w:r>
-        <w:rPr>
-          <w:bCs/>
-          <w:i/>
-          <w:color w:val="1F4E79"/>
-        </w:rPr>
-        <w:t>Claude</w:t>
-      </w:r>
-      <w:r>
-        <w:rPr>
-          <w:bCs/>
-          <w:i/>
-          <w:color w:val="1F4E79"/>
-        </w:rPr>
-        <w:t xml:space="preserve"> to create an isolated DB and to make tests </w:t>
+        <w:t xml:space="preserve"> I used Claude to create an isolated DB and to make tests </w:t>
       </w:r>
       <w:r>
         <w:rPr>
@@ -1238,23 +1222,7 @@
           <w:i/>
           <w:color w:val="1F4E79"/>
         </w:rPr>
-        <w:t xml:space="preserve">Step 5 – Bug fix: I asked </w:t>
-      </w:r>
-      <w:r>
-        <w:rPr>
-          <w:bCs/>
-          <w:i/>
-          <w:color w:val="1F4E79"/>
-        </w:rPr>
-        <w:t>Claude</w:t>
-      </w:r>
-      <w:r>
-        <w:rPr>
-          <w:bCs/>
-          <w:i/>
-          <w:color w:val="1F4E79"/>
-        </w:rPr>
-        <w:t xml:space="preserve"> to fix the bugs and retested the fixes manually.</w:t>
+        <w:t>Step 5 – Bug fix: I asked Claude to fix the bugs and retested the fixes manually.</w:t>
       </w:r>
     </w:p>
     <w:p>
@@ -1288,23 +1256,7 @@
           <w:i/>
           <w:color w:val="1F4E79"/>
         </w:rPr>
-        <w:t xml:space="preserve">Step 7: After some of the features were ready, in Ask mode, I asked </w:t>
-      </w:r>
-      <w:r>
-        <w:rPr>
-          <w:bCs/>
-          <w:i/>
-          <w:color w:val="1F4E79"/>
-        </w:rPr>
-        <w:t xml:space="preserve">Claude Opus </w:t>
-      </w:r>
-      <w:r>
-        <w:rPr>
-          <w:bCs/>
-          <w:i/>
-          <w:color w:val="1F4E79"/>
-        </w:rPr>
-        <w:t xml:space="preserve">for suggestions on how I could improve and make the project look more advanced, not like a school project. </w:t>
+        <w:t xml:space="preserve">Step 7: After some of the features were ready, in Ask mode, I asked Claude Opus for suggestions on how I could improve and make the project look more advanced, not like a school project. </w:t>
       </w:r>
       <w:r>
         <w:rPr>
@@ -1330,65 +1282,13 @@
         </w:rPr>
         <w:t xml:space="preserve">; frontend polish like toast notification on Save/delete. </w:t>
       </w:r>
-      <w:proofErr w:type="spellStart"/>
-      <w:r>
-        <w:rPr>
-          <w:bCs/>
-          <w:i/>
-          <w:color w:val="1F4E79"/>
-          <w:lang w:val="fr-FR"/>
-        </w:rPr>
-        <w:t>Confirm</w:t>
-      </w:r>
-      <w:proofErr w:type="spellEnd"/>
-      <w:r>
-        <w:rPr>
-          <w:bCs/>
-          <w:i/>
-          <w:color w:val="1F4E79"/>
-          <w:lang w:val="fr-FR"/>
-        </w:rPr>
-        <w:t xml:space="preserve"> dialogue </w:t>
-      </w:r>
-      <w:proofErr w:type="spellStart"/>
-      <w:r>
-        <w:rPr>
-          <w:bCs/>
-          <w:i/>
-          <w:color w:val="1F4E79"/>
-          <w:lang w:val="fr-FR"/>
-        </w:rPr>
-        <w:t>before</w:t>
-      </w:r>
-      <w:proofErr w:type="spellEnd"/>
-      <w:r>
-        <w:rPr>
-          <w:bCs/>
-          <w:i/>
-          <w:color w:val="1F4E79"/>
-          <w:lang w:val="fr-FR"/>
-        </w:rPr>
-        <w:t xml:space="preserve"> </w:t>
-      </w:r>
-      <w:proofErr w:type="spellStart"/>
-      <w:r>
-        <w:rPr>
-          <w:bCs/>
-          <w:i/>
-          <w:color w:val="1F4E79"/>
-          <w:lang w:val="fr-FR"/>
-        </w:rPr>
-        <w:t>deletion</w:t>
-      </w:r>
-      <w:proofErr w:type="spellEnd"/>
-      <w:r>
-        <w:rPr>
-          <w:bCs/>
-          <w:i/>
-          <w:color w:val="1F4E79"/>
-          <w:lang w:val="fr-FR"/>
-        </w:rPr>
-        <w:t xml:space="preserve">, etc. </w:t>
+      <w:r>
+        <w:rPr>
+          <w:bCs/>
+          <w:i/>
+          <w:color w:val="1F4E79"/>
+        </w:rPr>
+        <w:t xml:space="preserve">Confirm dialogue before deletion, etc. </w:t>
       </w:r>
       <w:r>
         <w:rPr>
@@ -1505,23 +1405,7 @@
           <w:i/>
           <w:color w:val="1F4E79"/>
         </w:rPr>
-        <w:t xml:space="preserve"> </w:t>
-      </w:r>
-      <w:r>
-        <w:rPr>
-          <w:bCs/>
-          <w:i/>
-          <w:color w:val="1F4E79"/>
-        </w:rPr>
-        <w:t>Claude Opus</w:t>
-      </w:r>
-      <w:r>
-        <w:rPr>
-          <w:bCs/>
-          <w:i/>
-          <w:color w:val="1F4E79"/>
-        </w:rPr>
-        <w:t>.</w:t>
+        <w:t xml:space="preserve"> Claude Opus.</w:t>
       </w:r>
     </w:p>
     <w:p>
@@ -2329,12 +2213,6 @@
       </w:r>
     </w:p>
     <w:p>
-      <w:pPr>
-        <w:rPr>
-          <w:i/>
-          <w:color w:val="1F4E79"/>
-        </w:rPr>
-      </w:pPr>
       <w:r>
         <w:rPr>
           <w:b/>
@@ -2354,10 +2232,110 @@
     </w:p>
     <w:p>
       <w:pPr>
+        <w:rPr>
+          <w:i/>
+          <w:color w:val="1F4E79"/>
+        </w:rPr>
+      </w:pPr>
+    </w:p>
+    <w:p>
+      <w:pPr>
         <w:pStyle w:val="Heading1"/>
       </w:pPr>
       <w:r>
         <w:t>Working System Evidence</w:t>
+      </w:r>
+    </w:p>
+    <w:p>
+      <w:pPr>
+        <w:rPr>
+          <w:b/>
+          <w:bCs/>
+          <w:color w:val="002060"/>
+          <w:sz w:val="24"/>
+          <w:szCs w:val="24"/>
+        </w:rPr>
+      </w:pPr>
+      <w:r>
+        <w:rPr>
+          <w:b/>
+          <w:bCs/>
+          <w:color w:val="002060"/>
+          <w:sz w:val="24"/>
+          <w:szCs w:val="24"/>
+        </w:rPr>
+        <w:t>4</w:t>
+      </w:r>
+      <w:r>
+        <w:rPr>
+          <w:b/>
+          <w:bCs/>
+          <w:color w:val="002060"/>
+          <w:sz w:val="24"/>
+          <w:szCs w:val="24"/>
+        </w:rPr>
+        <w:t>-</w:t>
+      </w:r>
+      <w:r>
+        <w:rPr>
+          <w:b/>
+          <w:bCs/>
+          <w:color w:val="002060"/>
+          <w:sz w:val="24"/>
+          <w:szCs w:val="24"/>
+        </w:rPr>
+        <w:t>minutes video with a demo ‘</w:t>
+      </w:r>
+      <w:r>
+        <w:rPr>
+          <w:b/>
+          <w:bCs/>
+          <w:color w:val="002060"/>
+          <w:sz w:val="24"/>
+          <w:szCs w:val="24"/>
+        </w:rPr>
+        <w:t>2026-06-29_Demo video.mp4</w:t>
+      </w:r>
+      <w:r>
+        <w:rPr>
+          <w:b/>
+          <w:bCs/>
+          <w:color w:val="002060"/>
+          <w:sz w:val="24"/>
+          <w:szCs w:val="24"/>
+        </w:rPr>
+        <w:t xml:space="preserve">’ is placed in the root directory </w:t>
+      </w:r>
+    </w:p>
+    <w:p>
+      <w:pPr>
+        <w:rPr>
+          <w:b/>
+          <w:bCs/>
+          <w:color w:val="002060"/>
+          <w:sz w:val="24"/>
+          <w:szCs w:val="24"/>
+        </w:rPr>
+      </w:pPr>
+      <w:r>
+        <w:rPr>
+          <w:b/>
+          <w:bCs/>
+          <w:color w:val="002060"/>
+          <w:sz w:val="24"/>
+          <w:szCs w:val="24"/>
+        </w:rPr>
+        <w:t xml:space="preserve">It can be watched on this link as well: </w:t>
+      </w:r>
+      <w:r>
+        <w:rPr>
+          <w:b/>
+          <w:bCs/>
+          <w:color w:val="002060"/>
+          <w:sz w:val="24"/>
+          <w:szCs w:val="24"/>
+        </w:rPr>
+        <w:t>https://app.screencast.com/3CEDg1lEmSYPS</w:t>
       </w:r>
     </w:p>
     <w:p/>

</xml_diff>